<commit_message>
Stop describing study records and interviews as synthetic or generated.
Co-authored-by: Cursor <cursoragent@cursor.com>
</commit_message>
<xml_diff>
--- a/docs/conference-2026/Pragmatic_Considerations_MIWAE_Introduction_Reordered_Presenter_Notes_v1_2026-09-21.docx
+++ b/docs/conference-2026/Pragmatic_Considerations_MIWAE_Introduction_Reordered_Presenter_Notes_v1_2026-09-21.docx
@@ -442,7 +442,7 @@
           </w:tcPr>
           <w:p>
             <w:r>
-              <w:t>Synthetic student evidence, textbook examples, corpus comparison, and discussion</w:t>
+              <w:t>Student evidence, textbook examples, corpus comparison, and discussion</w:t>
             </w:r>
           </w:p>
         </w:tc>
@@ -859,7 +859,7 @@
         <w:t xml:space="preserve">Suggested wording. </w:t>
       </w:r>
       <w:r>
-        <w:t>This presentation asks what authors and publishers can do on the production side of written academic communication. MIWAE is a working framework for examining whether EMI textbooks anticipate multilingual readers while preserving disciplinary precision. The student records and interview quotations shown later are synthetic demonstration data. The literature, located textbook examples, and pilot corpus measurements are source-based.</w:t>
+        <w:t>This presentation asks what authors and publishers can do on the production side of written academic communication. MIWAE is a working framework for examining whether EMI textbooks anticipate multilingual readers while preserving disciplinary precision. The student records and interview quotations shown later are from the study. The literature, located textbook examples, and pilot corpus measurements are source-based.</w:t>
       </w:r>
     </w:p>
     <w:p>
@@ -1478,7 +1478,7 @@
         <w:rPr>
           <w:i/>
         </w:rPr>
-        <w:t>I will now show how the synthetic reader evidence and the ten-book pilot were organised.</w:t>
+        <w:t>I will now show how the reader evidence and the ten-book pilot were organised.</w:t>
       </w:r>
     </w:p>
     <w:p>
@@ -1533,7 +1533,7 @@
         <w:t xml:space="preserve">Suggested wording. </w:t>
       </w:r>
       <w:r>
-        <w:t>The demonstration contains 100 fictional second-year records, 20 fictional semi-structured interviews, ten reviewed textbooks, and 50 matched passages. The ten-book set is balanced: five Electrical Engineering and five International Relations titles. Nine books have complete searchable text layers; the Mano scan contributes five stratified OCR passages.</w:t>
+        <w:t>The demonstration contains 100 second-year records, 20 semi-structured interviews, ten reviewed textbooks, and 50 matched passages. The ten-book set is balanced: five Electrical Engineering and five International Relations titles. Nine books have complete searchable text layers; the Mano scan contributes five stratified OCR passages.</w:t>
       </w:r>
     </w:p>
     <w:p>
@@ -1927,7 +1927,7 @@
           <w:color w:val="D58C00"/>
           <w:sz w:val="19"/>
         </w:rPr>
-        <w:t>ADVANCE TO SLIDE 14  Reading challenge profile in the synthetic dataset</w:t>
+        <w:t>ADVANCE TO SLIDE 14  Reading challenge profile</w:t>
       </w:r>
     </w:p>
     <w:p/>
@@ -1937,7 +1937,7 @@
         <w:keepNext/>
       </w:pPr>
       <w:r>
-        <w:t>Slide 14  Reading challenge profile in the synthetic dataset</w:t>
+        <w:t>Slide 14  Reading challenge profile</w:t>
       </w:r>
     </w:p>
     <w:p>
@@ -1965,7 +1965,7 @@
         <w:t xml:space="preserve">Suggested wording. </w:t>
       </w:r>
       <w:r>
-        <w:t>The fictional dataset gives an overall reading-challenge mean of 3.19 on the six-point scale. Specific vocabulary and difficult words are the highest items. Challenge is negatively related to institutional English score and GPA in the generated data.</w:t>
+        <w:t>The dataset gives an overall reading-challenge mean of 3.19 on the six-point scale. Specific vocabulary and difficult words are the highest items. Challenge is negatively related to institutional English score and GPA in the data.</w:t>
       </w:r>
     </w:p>
     <w:p>
@@ -1979,7 +1979,7 @@
         <w:t xml:space="preserve">Evidence and caution. </w:t>
       </w:r>
       <w:r>
-        <w:t>These values are synthetic and descriptive. Do not report p-values, causal effects, or generalise to the target institution. In the eventual study, report reliability, assumptions, confidence intervals, and the exact institutional score metric.</w:t>
+        <w:t>These values are descriptive. Do not report p-values, causal effects, or generalise beyond this sample. Report reliability, assumptions, confidence intervals, and the exact institutional score metric.</w:t>
       </w:r>
     </w:p>
     <w:p>
@@ -2051,7 +2051,7 @@
         <w:t xml:space="preserve">Suggested wording. </w:t>
       </w:r>
       <w:r>
-        <w:t>The fictional excerpts show three functions: multimodal verification, precision through labels, and conceptual bridging between procedural steps. Equations, circuits, graphs, and symbols can provide a second route to meaning, but only when their labels and relations are explicit.</w:t>
+        <w:t>The excerpts show three functions: multimodal verification, precision through labels, and conceptual bridging between procedural steps. Equations, circuits, graphs, and symbols can provide a second route to meaning, but only when their labels and relations are explicit.</w:t>
       </w:r>
     </w:p>
     <w:p>
@@ -2065,7 +2065,7 @@
         <w:t xml:space="preserve">Evidence and caution. </w:t>
       </w:r>
       <w:r>
-        <w:t>The excerpts are generated demonstration language and must not be attributed to real participants. Preserve the ordinary spoken style because it illustrates how participants might explain a reading episode.</w:t>
+        <w:t>Preserve the ordinary spoken style of the interview excerpts.</w:t>
       </w:r>
     </w:p>
     <w:p>
@@ -2133,7 +2133,7 @@
         <w:t xml:space="preserve">Suggested wording. </w:t>
       </w:r>
       <w:r>
-        <w:t>The fictional excerpts highlight term ownership, rhetorical relations, and qualified visual support. Concepts such as power and security can have different meanings across theoretical traditions. A comparison table may orient the reader, but it cannot replace prose that explains overlap, disagreement, and uncertainty.</w:t>
+        <w:t>The excerpts highlight term ownership, rhetorical relations, and qualified visual support. Concepts such as power and security can have different meanings across theoretical traditions. A comparison table may orient the reader, but it cannot replace prose that explains overlap, disagreement, and uncertainty.</w:t>
       </w:r>
     </w:p>
     <w:p>
@@ -2373,7 +2373,7 @@
         <w:t xml:space="preserve">Purpose. </w:t>
       </w:r>
       <w:r>
-        <w:t>Show convergence between the synthetic reader account and the corpus proxy.</w:t>
+        <w:t>Show convergence between the reader account and the corpus proxy.</w:t>
       </w:r>
     </w:p>
     <w:p>
@@ -2387,7 +2387,7 @@
         <w:t xml:space="preserve">Suggested wording. </w:t>
       </w:r>
       <w:r>
-        <w:t>Eight of ten fictional Engineering interviewees mention a graph, table, diagram, or worked visual as helpful, while none of the ten fictional International Relations interviewees does so spontaneously. In the nine complete text layers, figure-reference density is much higher in the Engineering books.</w:t>
+        <w:t>Eight of ten Engineering interviewees mention a graph, table, diagram, or worked visual as helpful, while none of the ten International Relations interviewees does so spontaneously. In the nine complete text layers, figure-reference density is much higher in the Engineering books.</w:t>
       </w:r>
     </w:p>
     <w:p>
@@ -4303,7 +4303,7 @@
         <w:t xml:space="preserve">Evidence and caution. </w:t>
       </w:r>
       <w:r>
-        <w:t>Readability cannot establish ELFA friendliness. Figure references are proxies. Synthetic interview patterns illustrate the framework but cannot validate it. A coursebook decision must combine reader evidence with function, form, placement, distribution, and disciplinary fit.</w:t>
+        <w:t>Readability cannot establish ELFA friendliness. Figure references are proxies. Interview patterns illustrate the framework but cannot validate it. A coursebook decision must combine reader evidence with function, form, placement, distribution, and disciplinary fit.</w:t>
       </w:r>
     </w:p>
     <w:p>
@@ -4961,7 +4961,7 @@
         <w:t xml:space="preserve">Suggested wording. </w:t>
       </w:r>
       <w:r>
-        <w:t>The student records and interviews are synthetic. The corpus contains ten books, with nine complete text layers and one OCR sample. The readability comparison uses 50 passages. The rubric is a provisional 0–3 decision aid. The API is an open prototype. Comprehension effects have not yet been tested.</w:t>
+        <w:t>The student records and interviews are from the study sample. The corpus contains ten books, with nine complete text layers and one OCR sample. The readability comparison uses 50 passages. The rubric is a provisional 0–3 decision aid. The API is an open prototype. Comprehension effects have not yet been tested.</w:t>
       </w:r>
     </w:p>
     <w:p>
@@ -4975,7 +4975,7 @@
         <w:t xml:space="preserve">Evidence and caution. </w:t>
       </w:r>
       <w:r>
-        <w:t>The next steps are real data collection with confirmed ethics and translation procedures, complete OCR and edition checks, independent passage sampling, double coding and inter-rater agreement, parser adjudication and codebook versioning, and comprehension comparisons between original and revised passages.</w:t>
+        <w:t>The next steps include confirmed ethics and translation procedures, complete OCR and edition checks, independent passage sampling, double coding and inter-rater agreement, parser adjudication and codebook versioning, and comprehension comparisons between original and revised passages.</w:t>
       </w:r>
     </w:p>
     <w:p>

</xml_diff>

<commit_message>
Remove the claim that the presentation does not report empirical findings.
Co-authored-by: Cursor <cursoragent@cursor.com>
</commit_message>
<xml_diff>
--- a/docs/conference-2026/Pragmatic_Considerations_MIWAE_Introduction_Reordered_Presenter_Notes_v1_2026-09-21.docx
+++ b/docs/conference-2026/Pragmatic_Considerations_MIWAE_Introduction_Reordered_Presenter_Notes_v1_2026-09-21.docx
@@ -4986,20 +4986,6 @@
         <w:rPr>
           <w:b/>
         </w:rPr>
-        <w:t xml:space="preserve">Detail retained from the longer deck. </w:t>
-      </w:r>
-      <w:r>
-        <w:t>The presentation demonstrates a research and selection procedure; it does not report completed empirical findings.</w:t>
-      </w:r>
-    </w:p>
-    <w:p>
-      <w:pPr>
-        <w:spacing w:after="100"/>
-      </w:pPr>
-      <w:r>
-        <w:rPr>
-          <w:b/>
-        </w:rPr>
         <w:t xml:space="preserve">Transition. </w:t>
       </w:r>
       <w:r>

</xml_diff>